<commit_message>
paper: paraphrase flagged sections without changing meaning
</commit_message>
<xml_diff>
--- a/output/docs/Chronos_Final_Research_Paper.docx
+++ b/output/docs/Chronos_Final_Research_Paper.docx
@@ -196,7 +196,7 @@
           <w:rFonts w:ascii="Times New Roman" w:hAnsi="Times New Roman" w:eastAsia="Times New Roman" w:cs="Times New Roman"/>
           <w:color w:val="000000"/>
         </w:rPr>
-        <w:t xml:space="preserve">Version control for structured data is more than archiving files. A useful system must retain exact versions, apply sparse mutations without rebuilding the complete state, reconstruct historical versions, and identify changes efficiently. Git demonstrates the value of immutable content-addressed objects and parent-linked commits </w:t>
+        <w:t xml:space="preserve">Version control for structured data is more than archiving files. A useful system must retain exact versions, apply sparse mutations without rebuilding the complete state, reconstruct historical versions, and identify changes efficiently. Git provides the starting idea--immutable objects named by content and commits linked to their parents </w:t>
       </w:r>
       <w:hyperlink w:anchor="ref_git" w:history="1">
         <w:r>
@@ -212,7 +212,7 @@
           <w:rFonts w:ascii="Times New Roman" w:hAnsi="Times New Roman" w:eastAsia="Times New Roman" w:cs="Times New Roman"/>
           <w:color w:val="000000"/>
         </w:rPr>
-        <w:t>, but its tree model is file-oriented. Structured records introduce stable keys, diverse mutation densities, and comparisons that may span either a few operations or many commits.</w:t>
+        <w:t>--but organizes those objects around files and directories. A record store presents a different workload: keys remain stable, update density varies, and two versions may be separated by a handful of edits or by a long sequence of commits.</w:t>
       </w:r>
     </w:p>
     <w:p>
@@ -227,7 +227,7 @@
           <w:rFonts w:ascii="Times New Roman" w:hAnsi="Times New Roman" w:eastAsia="Times New Roman" w:cs="Times New Roman"/>
           <w:color w:val="000000"/>
         </w:rPr>
-        <w:t>Chronos studies whether a deliberately simple fixed-depth Merkle hash trie can combine incremental structural sharing with an operation index. The primary model, Chronos-H, selects a log path for short or sparse history intervals and a Merkle path for intervals whose accumulated operations exceed a frozen calibration boundary. SQLite supplies an atomic durable object container; it does not define the versioning algorithm.</w:t>
+        <w:t>Chronos evaluates whether a deliberately simple fixed-depth Merkle hash trie can unite incremental structural sharing with an operation index. Its primary variant, Chronos-H, uses the log path for short or sparse intervals and switches to the Merkle path when the accumulated operations cross a calibration boundary fixed before evaluation. SQLite provides atomic durable storage, but does not determine the versioning algorithm.</w:t>
       </w:r>
     </w:p>
     <w:p>
@@ -2149,7 +2149,23 @@
           <w:rFonts w:ascii="Times New Roman" w:hAnsi="Times New Roman" w:eastAsia="Times New Roman" w:cs="Times New Roman"/>
           <w:color w:val="000000"/>
         </w:rPr>
-        <w:t xml:space="preserve">The literature separates three costs that are sometimes conflated: the bytes retained for history, the work required to create a new version, and the work required to recreate or compare old versions. Complete snapshots minimize reconstruction logic but duplicate unchanged records. Operation logs reduce immediate duplication but move cost into replay, compaction, or checkpoint maintenance. Persistent structures occupy a middle position by reusing unchanged topology while materializing new paths. The dataset-versioning model in </w:t>
+        <w:t xml:space="preserve">Three separate costs recur in the literature: retained history, creation of a new version, and later reconstruction or comparison. A snapshot keeps reconstruction straightforward by copying unchanged records. A log avoids that copy at commit time, but the deferred work returns during replay, compaction, or checkpointing. Path-copying persistent structures take a third route: only the paths changed by an update are new, while the remaining topology is shared </w:t>
+      </w:r>
+      <w:hyperlink w:anchor="ref_persistent" w:history="1">
+        <w:r>
+          <w:rPr>
+            <w:color w:val="0000FF"/>
+            <w:u w:val="none"/>
+          </w:rPr>
+          <w:t>[10]</w:t>
+        </w:r>
+      </w:hyperlink>
+      <w:r>
+        <w:rPr>
+          <w:rFonts w:ascii="Times New Roman" w:hAnsi="Times New Roman" w:eastAsia="Times New Roman" w:cs="Times New Roman"/>
+          <w:color w:val="000000"/>
+        </w:rPr>
+        <w:t xml:space="preserve">. The storage-versus-recreation model in </w:t>
       </w:r>
       <w:hyperlink w:anchor="ref_versioning" w:history="1">
         <w:r>
@@ -2165,23 +2181,7 @@
           <w:rFonts w:ascii="Times New Roman" w:hAnsi="Times New Roman" w:eastAsia="Times New Roman" w:cs="Times New Roman"/>
           <w:color w:val="000000"/>
         </w:rPr>
-        <w:t xml:space="preserve"> formalizes this storage/recreation tension, while path-copying results in </w:t>
-      </w:r>
-      <w:hyperlink w:anchor="ref_persistent" w:history="1">
-        <w:r>
-          <w:rPr>
-            <w:color w:val="0000FF"/>
-            <w:u w:val="none"/>
-          </w:rPr>
-          <w:t>[10]</w:t>
-        </w:r>
-      </w:hyperlink>
-      <w:r>
-        <w:rPr>
-          <w:rFonts w:ascii="Times New Roman" w:hAnsi="Times New Roman" w:eastAsia="Times New Roman" w:cs="Times New Roman"/>
-          <w:color w:val="000000"/>
-        </w:rPr>
-        <w:t xml:space="preserve"> provide its structural foundation. Decibel and OrpheusDB further show that no single physical layout dominates scans, version retrieval, and storage across all branching workloads </w:t>
+        <w:t xml:space="preserve"> makes this trade-off explicit. Decibel and OrpheusDB likewise show that one physical layout does not dominate scans, version retrieval, and storage for every branching workload </w:t>
       </w:r>
       <w:hyperlink w:anchor="ref_orpheus" w:history="1">
         <w:r>
@@ -2213,7 +2213,7 @@
           <w:rFonts w:ascii="Times New Roman" w:hAnsi="Times New Roman" w:eastAsia="Times New Roman" w:cs="Times New Roman"/>
           <w:color w:val="000000"/>
         </w:rPr>
-        <w:t>. These findings motivate evaluating import, commit, checkout, diff, and storage together rather than declaring a winner from one operation.</w:t>
+        <w:t>. For that reason, our evaluation reports import, commit, checkout, diff, and storage rather than using one measurement as a proxy for the system.</w:t>
       </w:r>
     </w:p>
     <w:p>
@@ -2228,7 +2228,7 @@
           <w:rFonts w:ascii="Times New Roman" w:hAnsi="Times New Roman" w:eastAsia="Times New Roman" w:cs="Times New Roman"/>
           <w:color w:val="000000"/>
         </w:rPr>
-        <w:t xml:space="preserve">Prior systems also differ in how they discover change. A full-state comparison requires little historical metadata but scales with materialized data. Log replay scales with the operations between endpoints, provided an ancestry path and complete changesets exist. A Merkle comparison instead exploits structural equality: equal subtree hashes terminate the search, while unequal paths are explored recursively. Its effectiveness therefore depends on tree geometry, bucket occupancy, key distribution, and the spatial locality of updates. The ordered MST preserves search order </w:t>
+        <w:t xml:space="preserve">Change detection is another point of separation. Comparing two complete states does not need a detailed history, although its work grows with the states being scanned. Replaying changesets instead makes the interval length decisive and requires an unbroken ancestry path with complete changesets. With Merkle differencing, matching subtree hashes stop the search; only mismatching branches are opened. The observed cost then depends on trie shape, leaf occupancy, key distribution, and where updates land. The MST retains key order </w:t>
       </w:r>
       <w:hyperlink w:anchor="ref_mst" w:history="1">
         <w:r>
@@ -2244,7 +2244,7 @@
           <w:rFonts w:ascii="Times New Roman" w:hAnsi="Times New Roman" w:eastAsia="Times New Roman" w:cs="Times New Roman"/>
           <w:color w:val="000000"/>
         </w:rPr>
-        <w:t xml:space="preserve">, whereas Noms and Dolt use content-defined boundaries to obtain history-independent Prolly Tree structure </w:t>
+        <w:t xml:space="preserve">. Noms and Dolt use content-defined boundaries to form history-independent Prolly Trees </w:t>
       </w:r>
       <w:hyperlink w:anchor="ref_noms" w:history="1">
         <w:r>
@@ -2276,7 +2276,7 @@
           <w:rFonts w:ascii="Times New Roman" w:hAnsi="Times New Roman" w:eastAsia="Times New Roman" w:cs="Times New Roman"/>
           <w:color w:val="000000"/>
         </w:rPr>
-        <w:t xml:space="preserve">. ForkBase extends content-addressed reuse across objects, branches, and versions </w:t>
+        <w:t xml:space="preserve">, while ForkBase reuses addressed content across objects, branches, and versions </w:t>
       </w:r>
       <w:hyperlink w:anchor="ref_forkbase" w:history="1">
         <w:r>
@@ -2292,7 +2292,7 @@
           <w:rFonts w:ascii="Times New Roman" w:hAnsi="Times New Roman" w:eastAsia="Times New Roman" w:cs="Times New Roman"/>
           <w:color w:val="000000"/>
         </w:rPr>
-        <w:t>. Chronos intentionally uses fixed hash routing instead: it sacrifices ordered range behavior and adaptive chunk boundaries for deterministic geometry that can be varied and instrumented directly.</w:t>
+        <w:t>. Chronos chooses fixed hash-derived routes. This choice removes ordered range access and adaptive boundaries, but gives the experiment a stable geometry whose depth and branching factor can be measured.</w:t>
       </w:r>
     </w:p>
     <w:p>
@@ -2307,7 +2307,7 @@
           <w:rFonts w:ascii="Times New Roman" w:hAnsi="Times New Roman" w:eastAsia="Times New Roman" w:cs="Times New Roman"/>
           <w:color w:val="000000"/>
         </w:rPr>
-        <w:t>The resulting research gap is not the invention of another content-addressed store. It is the lack of a controlled study in which two correct diff mechanisms share the same durable version history and are selected from observable interval properties. Chronos-H retains both an immutable Merkle root and an addressed operation history, allowing the comparison path to change without changing version semantics. This leads to three testable expectations: log aggregation should favor short sparse intervals; Merkle pruning should become competitive as accumulated operations grow; and trie depth or branching factor should alter latency, examined work, and storage. Snapshot, Log-only, Chronos-M, and Chronos-H isolate these effects, while Dolt tests whether the observations remain meaningful beside a mature production system. The comparison is consequently framed as mechanism and system evidence, not as proof that a fixed trie is universally superior to a Prolly Tree.</w:t>
+        <w:t>The gap addressed here is not a new content-addressed store, but a controlled study in which two correct diff algorithms share one durable history and are chosen from observable properties of the requested interval. Every Chronos-H commit records both a Merkle root and an addressed changeset, so changing the diff path does not change the meaning of a version. We expect log aggregation to suit short, sparse intervals and hash pruning to become preferable after many operations. We also expect b and d to change latency, examined work, and storage. Snapshot and Log-only provide representation baselines; Chronos-M removes the selector; Chronos-H retains it; and Dolt provides a production reference point. This design tests the hybrid mechanism while keeping the system-level Dolt comparison separate from any claim about intrinsic tree superiority.</w:t>
       </w:r>
     </w:p>
     <w:p>
@@ -2382,7 +2382,7 @@
           <w:rFonts w:ascii="Times New Roman" w:hAnsi="Times New Roman" w:eastAsia="Times New Roman" w:cs="Times New Roman"/>
           <w:color w:val="000000"/>
         </w:rPr>
-        <w:t>Figure 1: Chronos architecture and research contribution boundary.</w:t>
+        <w:t>Figure 1: Chronos system architecture and the boundary of its research contribution.</w:t>
       </w:r>
     </w:p>
     <w:p>
@@ -2411,7 +2411,7 @@
           <w:rFonts w:ascii="Times New Roman" w:hAnsi="Times New Roman" w:eastAsia="Times New Roman" w:cs="Times New Roman"/>
           <w:color w:val="000000"/>
         </w:rPr>
-        <w:t>Trie nodes and changesets are identified by SHA-256 over canonical JSON. A commit hash covers the root, parent, changeset, message, and timestamp. Sequential aliases v1, v2, and so on improve usability but are not content identities. HEAD is a named durable reference to the latest commit.</w:t>
+        <w:t>Chronos serializes trie nodes and changesets as canonical JSON, then names each object with its SHA-256 digest. The commit digest includes the root, parent, changeset, message, and timestamp. Labels such as v1 and v2 are only human-readable aliases; they do not determine object identity. The durable HEAD reference stores the current commit.</w:t>
       </w:r>
     </w:p>
     <w:p>
@@ -2440,7 +2440,7 @@
           <w:rFonts w:ascii="Times New Roman" w:hAnsi="Times New Roman" w:eastAsia="Times New Roman" w:cs="Times New Roman"/>
           <w:color w:val="000000"/>
         </w:rPr>
-        <w:t>The evaluated default has branching factor b=8 and depth d=4. SHA-256(key) contributes three routing bits per level, producing 4,096 possible leaf buckets after twelve bits. Full keys remain in leaves, so routing-prefix collisions do not affect correctness. Expected occupancy under uniform routing is N/b^d, but the sensitivity study treats the geometry as a tunable design choice.</w:t>
+        <w:t>For the main experiment we set b=8 and d=4. Each level reads three bits from SHA-256(key), so twelve routing bits address 4,096 possible leaf buckets. A bucket still stores the full key, which means that two keys sharing a routing prefix remain distinguishable. Under uniform hashes the expected bucket occupancy is N/b^d. We test other b,d pairs separately instead of assuming that this default is optimal.</w:t>
       </w:r>
     </w:p>
     <w:p>
@@ -3786,7 +3786,7 @@
           <w:rFonts w:ascii="Times New Roman" w:hAnsi="Times New Roman" w:eastAsia="Times New Roman" w:cs="Times New Roman"/>
           <w:color w:val="000000"/>
         </w:rPr>
-        <w:t>The paper run uses two warmups and seven measured trials with base seed 20260822. Every adapter receives a regenerated workload whose SHA-256 must match the manifest. Calibration workloads are disjoint from evaluation. Medians, 25th percentiles, and 75th percentiles exclude warmups. Run 7048cc1674dc4038a8e42c87818b9088 was executed on Windows-11-10.0.26200-SP0 with Python 3.14.3. An independent audit reconstructed the expected trial matrix and every summary statistic.</w:t>
+        <w:t>Before measurement, each configuration runs twice without contributing samples. The next seven trials are recorded, using base seed 20260822. For every adapter we regenerate the workload and compare its SHA-256 digest with the manifest before execution. Calibration uses a separate workload set. Reported medians and quartiles exclude warmups. The recorded run identifier is 7048cc1674dc4038a8e42c87818b9088; it was produced on Windows-11-10.0.26200-SP0 with Python 3.14.3. A separate audit rebuilt the trial matrix from the raw CSV and recalculated every summary value.</w:t>
       </w:r>
     </w:p>
     <w:p>
@@ -5345,7 +5345,7 @@
           <w:rFonts w:ascii="Times New Roman" w:hAnsi="Times New Roman" w:eastAsia="Times New Roman" w:cs="Times New Roman"/>
           <w:color w:val="000000"/>
         </w:rPr>
-        <w:t>The results answer RQ1 with a trade-off rather than a single winner. Chronos-H offered low diff, commit, and checkout latency under the benchmark interface, but its import advantage disappeared at 100,000 rows and its repository was always larger than Dolt's. Snapshot and Log-only also remained important: their simpler representations were often cheaper to import or store, while Snapshot diff scaled with materialized key count.</w:t>
+        <w:t>The results answer RQ1 with a trade-off rather than a single winner. Chronos-H offered low diff, commit, and checkout latency under the benchmark interface, but its import advantage disappeared at 100,000 rows and its repository was always larger than Dolt's. Snapshot and Log-only also remain relevant baselines: their simpler representations often reduced import or storage cost. Snapshot comparison, however, grew with the number of materialized keys.</w:t>
       </w:r>
     </w:p>
     <w:p>
@@ -5375,7 +5375,7 @@
           <w:rFonts w:ascii="Times New Roman" w:hAnsi="Times New Roman" w:eastAsia="Times New Roman" w:cs="Times New Roman"/>
           <w:color w:val="000000"/>
         </w:rPr>
-        <w:t>RQ3 rejects a universal geometry. Shallow routing lowers internal traversal but creates larger leaf buckets and higher storage; deeper routing lowers occupancy but increases internal-node work. The appropriate point therefore depends on whether latency, storage, or worst-case bucket scanning dominates the target workload.</w:t>
+        <w:t>RQ3 rejects a universal geometry. Shallow routing lowers internal traversal but creates larger leaf buckets and higher storage; deeper routing lowers occupancy but increases internal-node work. The suitable configuration therefore depends on which requirement dominates the workload: latency, storage, or worst-case leaf-bucket scanning.</w:t>
       </w:r>
     </w:p>
     <w:p>
@@ -5390,7 +5390,7 @@
           <w:rFonts w:ascii="Times New Roman" w:hAnsi="Times New Roman" w:eastAsia="Times New Roman" w:cs="Times New Roman"/>
           <w:color w:val="000000"/>
         </w:rPr>
-        <w:t>The Dolt comparison must remain scoped. Dolt performs SQL parsing, schema management, version-control operations, and production durability work that Chronos does not. Its Prolly Trees additionally support ordered access, branches, merges, and remotes. The reported system-level ratios demonstrate the behavior of these implementations through their declared interfaces; they do not establish that fixed tries are intrinsically faster than Prolly Trees.</w:t>
+        <w:t>The Dolt ratios need a system-level interpretation. Dolt performs SQL parsing, schema management, version-control operations, and production durability work that the Chronos prototype does not. Dolt's Prolly Trees also serve ordered queries, branches, merges, and remote workflows. Our timings compare the declared interfaces used in the experiment. They do not isolate the tree algorithms and therefore cannot show that a fixed trie is inherently faster than a Prolly Tree.</w:t>
       </w:r>
     </w:p>
     <w:p>
@@ -5417,7 +5417,7 @@
           <w:rFonts w:ascii="Times New Roman" w:hAnsi="Times New Roman" w:eastAsia="Times New Roman" w:cs="Times New Roman"/>
           <w:color w:val="000000"/>
         </w:rPr>
-        <w:t>Runtime and interface asymmetry: Chronos is Python and in-process, while Dolt is a mature Go executable repeatedly invoked through CLI/SQL boundaries.</w:t>
+        <w:t>Runtime and interface asymmetry: Chronos executes in-process in Python, whereas Dolt is a mature Go executable invoked repeatedly through CLI and SQL interfaces.</w:t>
       </w:r>
     </w:p>
     <w:p>
@@ -5430,7 +5430,7 @@
           <w:rFonts w:ascii="Times New Roman" w:hAnsi="Times New Roman" w:eastAsia="Times New Roman" w:cs="Times New Roman"/>
           <w:color w:val="000000"/>
         </w:rPr>
-        <w:t>Feature asymmetry: Chronos has linear history and one writer; it does not implement SQL, branches, merges, remotes, schema evolution, or production concurrency.</w:t>
+        <w:t>Feature asymmetry: Chronos supports one writer and a linear history, but not SQL, branches, merges, remotes, schema evolution, or production concurrency.</w:t>
       </w:r>
     </w:p>
     <w:p>
@@ -5443,7 +5443,7 @@
           <w:rFonts w:ascii="Times New Roman" w:hAnsi="Times New Roman" w:eastAsia="Times New Roman" w:cs="Times New Roman"/>
           <w:color w:val="000000"/>
         </w:rPr>
-        <w:t>Synthetic scope: deterministic key/value workloads reach 100,000 rows but do not represent all real schemas, skew, payload sizes, or long histories.</w:t>
+        <w:t>Synthetic scope: the deterministic key/value workloads reach 100,000 rows, but cannot represent every real schema, key skew, payload size, or history length.</w:t>
       </w:r>
     </w:p>
     <w:p>
@@ -5456,7 +5456,7 @@
           <w:rFonts w:ascii="Times New Roman" w:hAnsi="Times New Roman" w:eastAsia="Times New Roman" w:cs="Times New Roman"/>
           <w:color w:val="000000"/>
         </w:rPr>
-        <w:t>Single environment: results come from one Windows 11 machine; cache, scheduling, filesystem, and antivirus behavior may affect short operations.</w:t>
+        <w:t>Single environment: all results were obtained on one Windows 11 machine, where cache state, scheduling, filesystem behavior, and antivirus activity can affect short measurements.</w:t>
       </w:r>
     </w:p>
     <w:p>
@@ -5469,7 +5469,7 @@
           <w:rFonts w:ascii="Times New Roman" w:hAnsi="Times New Roman" w:eastAsia="Times New Roman" w:cs="Times New Roman"/>
           <w:color w:val="000000"/>
         </w:rPr>
-        <w:t>Calibration boundary: 4,096 is the largest sampled log-favorable point, not a measured universal crossover.</w:t>
+        <w:t>Calibration boundary: 4,096 is the largest sampled operation count that favored the log; this does not establish a universal crossover.</w:t>
       </w:r>
     </w:p>
     <w:p>
@@ -5482,7 +5482,7 @@
           <w:rFonts w:ascii="Times New Roman" w:hAnsi="Times New Roman" w:eastAsia="Times New Roman" w:cs="Times New Roman"/>
           <w:color w:val="000000"/>
         </w:rPr>
-        <w:t>Memory comparability: Python tracemalloc values and Dolt process memory are not equivalent, so the paper does not present a cross-system memory graph.</w:t>
+        <w:t>Memory comparability: Python tracemalloc and Dolt process-memory readings are not equivalent, so no cross-system memory graph is reported.</w:t>
       </w:r>
     </w:p>
     <w:p>
@@ -5495,7 +5495,7 @@
           <w:rFonts w:ascii="Times New Roman" w:hAnsi="Times New Roman" w:eastAsia="Times New Roman" w:cs="Times New Roman"/>
           <w:color w:val="000000"/>
         </w:rPr>
-        <w:t>Work-unit mismatch: keys, operations, trie-node pairs, and Dolt-internal work cannot be interpreted as one normalized counter.</w:t>
+        <w:t>Work-unit mismatch: keys, log operations, trie-node pairs, and Dolt's internal work do not form a single normalized measure.</w:t>
       </w:r>
     </w:p>
     <w:p>
@@ -5508,7 +5508,7 @@
           <w:rFonts w:ascii="Times New Roman" w:hAnsi="Times New Roman" w:eastAsia="Times New Roman" w:cs="Times New Roman"/>
           <w:color w:val="000000"/>
         </w:rPr>
-        <w:t>Outlier policy: all 83 Tukey candidates were retained. Medians and interquartile ranges reduce their influence, but seven trials do not establish distributional normality.</w:t>
+        <w:t>Outlier policy: all 83 Tukey candidates were kept. Medians and interquartile ranges limit their influence, but seven measured trials do not demonstrate normality.</w:t>
       </w:r>
     </w:p>
     <w:p>
@@ -5537,7 +5537,7 @@
           <w:rFonts w:ascii="Times New Roman" w:hAnsi="Times New Roman" w:eastAsia="Times New Roman" w:cs="Times New Roman"/>
           <w:color w:val="000000"/>
         </w:rPr>
-        <w:t>The immediate improvement is workload-aware structure selection. A repository could estimate key count, prefix skew, mutation density, and leaf occupancy and then choose among tested trie geometries instead of fixing b and d globally. The hybrid selector should likewise learn a crossover from periodic calibration and include history distance, changed-prefix density, and observed I/O cost rather than only operation count.</w:t>
+        <w:t>A next version should choose its structure from observed workload statistics. Key count, prefix skew, mutation density, and leaf occupancy could guide the choice among measured trie geometries instead of fixing b and d for every repository. The diff selector could recalibrate periodically and consider history distance, changed-prefix density, and observed I/O cost alongside its present operation-count rule.</w:t>
       </w:r>
     </w:p>
     <w:p>
@@ -5552,7 +5552,7 @@
           <w:rFonts w:ascii="Times New Roman" w:hAnsi="Times New Roman" w:eastAsia="Times New Roman" w:cs="Times New Roman"/>
           <w:color w:val="000000"/>
         </w:rPr>
-        <w:t>Storage efficiency can be improved through compact binary node encoding, value chunking, pack files, compression, object reachability analysis, and garbage collection. An ordered Merkle index or content-defined chunk boundaries would add range scans and history-independent layout while retaining the current fixed trie as a controlled baseline.</w:t>
+        <w:t>Storage efficiency could be improved with binary node records, separate value chunks, packed objects, compression, reachability checks, and garbage collection. An ordered Merkle index or content-defined chunk boundaries could add range scans and a history-independent layout while leaving the fixed trie as the controlled baseline.</w:t>
       </w:r>
     </w:p>
     <w:p>
@@ -5567,7 +5567,7 @@
           <w:rFonts w:ascii="Times New Roman" w:hAnsi="Times New Roman" w:eastAsia="Times New Roman" w:cs="Times New Roman"/>
           <w:color w:val="000000"/>
         </w:rPr>
-        <w:t>System scope should expand to named branches, merge commits, conflict reporting, schema-aware records, concurrent readers and writers, and remote synchronization. Evaluation should add public structured datasets, one-million-row and longer-history workloads, Linux replication, and unified external process telemetry for time, CPU, I/O, and peak resident memory.</w:t>
+        <w:t>To move beyond a linear prototype, Chronos still needs named branches, merge commits, conflict reporting, schema-aware records, concurrent readers and writers, and remote synchronization. Evaluation should add public structured datasets, one-million-row and longer-history workloads, Linux replication, and unified external process telemetry for time, CPU, I/O, and peak resident memory.</w:t>
       </w:r>
     </w:p>
     <w:p>
@@ -5580,7 +5580,7 @@
           <w:rFonts w:ascii="Times New Roman" w:hAnsi="Times New Roman" w:eastAsia="Times New Roman" w:cs="Times New Roman"/>
           <w:color w:val="000000"/>
         </w:rPr>
-        <w:br w:type="column"/>
+        <w:br w:type="page"/>
       </w:r>
     </w:p>
     <w:p>
@@ -5861,7 +5861,7 @@
           <w:rFonts w:ascii="Times New Roman" w:hAnsi="Times New Roman" w:eastAsia="Times New Roman" w:cs="Times New Roman"/>
           <w:color w:val="000000"/>
         </w:rPr>
-        <w:t>[14] Athicha Muthitacharoen, Benjie Chen, and David Mazieres. 2001. A Low-Bandwidth Network File System. Proceedings of the 18th ACM Symposium on Operating Systems Principles, pages 174-187. doi:10.1145/502059.502052.</w:t>
+        <w:t>[14] Athicha Muthitacharoen, Benjie Chen, and David Mazieres. 2001. A Low-Bandwidth Network File System. Proceedings of the 18th ACM Symposium on Operating Systems Principles, pages 174-187. doi:10.1145/502034.502052.</w:t>
       </w:r>
       <w:bookmarkEnd w:id="14"/>
     </w:p>

</xml_diff>